<commit_message>
Update content: Add Tet music, update Fruit Tray, remove Couplets
</commit_message>
<xml_diff>
--- a/kich-ban-thuyet-trinh.docx
+++ b/kich-ban-thuyet-trinh.docx
@@ -157,25 +157,7 @@
           <w:sz w:val="28"/>
           <w:szCs w:val="28"/>
         </w:rPr>
-        <w:t>Vi Ngọc Quân</w:t>
-      </w:r>
-      <w:r>
-        <w:rPr>
-          <w:rFonts w:ascii="Times New Roman" w:eastAsia="Google Sans Text" w:hAnsi="Times New Roman" w:cs="Times New Roman"/>
-          <w:color w:val="1F1F1F"/>
-          <w:sz w:val="28"/>
-          <w:szCs w:val="28"/>
-        </w:rPr>
-        <w:t xml:space="preserve"> – PA05</w:t>
-      </w:r>
-      <w:r>
-        <w:rPr>
-          <w:rFonts w:ascii="Times New Roman" w:eastAsia="Google Sans Text" w:hAnsi="Times New Roman" w:cs="Times New Roman"/>
-          <w:color w:val="1F1F1F"/>
-          <w:sz w:val="28"/>
-          <w:szCs w:val="28"/>
-        </w:rPr>
-        <w:t>.</w:t>
+        <w:t>Vi Ngọc Quân – PA05.</w:t>
       </w:r>
     </w:p>
     <w:p>
@@ -861,53 +843,113 @@
       <w:r>
         <w:rPr>
           <w:rFonts w:ascii="Times New Roman" w:eastAsia="Google Sans Text" w:hAnsi="Times New Roman" w:cs="Times New Roman"/>
-          <w:b/>
-          <w:bCs/>
-          <w:color w:val="1F1F1F"/>
-          <w:sz w:val="28"/>
-          <w:szCs w:val="28"/>
-        </w:rPr>
-        <w:t xml:space="preserve">- </w:t>
-      </w:r>
-      <w:r>
-        <w:rPr>
-          <w:rFonts w:ascii="Times New Roman" w:eastAsia="Google Sans Text" w:hAnsi="Times New Roman" w:cs="Times New Roman"/>
-          <w:b/>
-          <w:bCs/>
-          <w:color w:val="1F1F1F"/>
-          <w:sz w:val="28"/>
-          <w:szCs w:val="28"/>
-        </w:rPr>
-        <w:t>Về chất lượng:</w:t>
-      </w:r>
-      <w:r>
-        <w:rPr>
-          <w:rFonts w:ascii="Times New Roman" w:eastAsia="Google Sans Text" w:hAnsi="Times New Roman" w:cs="Times New Roman"/>
-          <w:color w:val="1F1F1F"/>
-          <w:sz w:val="28"/>
-          <w:szCs w:val="28"/>
-        </w:rPr>
-        <w:t xml:space="preserve"> Nhân bánh đậm đà, được chọn lọc kỹ lưỡng cũng giống như sự </w:t>
-      </w:r>
-      <w:r>
-        <w:rPr>
-          <w:rFonts w:ascii="Times New Roman" w:eastAsia="Google Sans Text" w:hAnsi="Times New Roman" w:cs="Times New Roman"/>
-          <w:b/>
-          <w:bCs/>
-          <w:color w:val="1F1F1F"/>
-          <w:sz w:val="28"/>
-          <w:szCs w:val="28"/>
-        </w:rPr>
-        <w:t>tinh nhuệ, hiện đại</w:t>
-      </w:r>
-      <w:r>
-        <w:rPr>
-          <w:rFonts w:ascii="Times New Roman" w:eastAsia="Google Sans Text" w:hAnsi="Times New Roman" w:cs="Times New Roman"/>
-          <w:color w:val="1F1F1F"/>
-          <w:sz w:val="28"/>
-          <w:szCs w:val="28"/>
-        </w:rPr>
-        <w:t xml:space="preserve"> của lực lượng An ninh mạng (PA05). Trong bối cảnh mới, chúng tôi luôn phải chắt lọc thông tin, xử lý chính xác để bảo vệ an toàn cho hệ thống an ninh quốc gia.</w:t>
+          <w:color w:val="1F1F1F"/>
+          <w:sz w:val="28"/>
+          <w:szCs w:val="28"/>
+        </w:rPr>
+        <w:t>Chính sự kết hợp hài hòa giữa 'Nhu' và 'Cương', giữa ngoại giao khéo léo và pháp luật nghiêm minh đã tạo nên bản sắc của liên quân chúng tôi:</w:t>
+      </w:r>
+    </w:p>
+    <w:p>
+      <w:pPr>
+        <w:pBdr>
+          <w:top w:val="nil"/>
+          <w:left w:val="nil"/>
+          <w:bottom w:val="nil"/>
+          <w:right w:val="nil"/>
+          <w:between w:val="nil"/>
+        </w:pBdr>
+        <w:jc w:val="center"/>
+        <w:rPr>
+          <w:rFonts w:ascii="Times New Roman" w:eastAsia="Google Sans Text" w:hAnsi="Times New Roman" w:cs="Times New Roman"/>
+          <w:color w:val="1F1F1F"/>
+          <w:sz w:val="28"/>
+          <w:szCs w:val="28"/>
+        </w:rPr>
+      </w:pPr>
+      <w:r>
+        <w:rPr>
+          <w:rFonts w:ascii="Times New Roman" w:eastAsia="Google Sans Text" w:hAnsi="Times New Roman" w:cs="Times New Roman"/>
+          <w:b/>
+          <w:bCs/>
+          <w:color w:val="1F1F1F"/>
+          <w:sz w:val="28"/>
+          <w:szCs w:val="28"/>
+        </w:rPr>
+        <w:t>'Lạt mềm buộc chặt, ngoại giao khéo léo</w:t>
+      </w:r>
+      <w:r>
+        <w:rPr>
+          <w:rFonts w:ascii="Times New Roman" w:eastAsia="Google Sans Text" w:hAnsi="Times New Roman" w:cs="Times New Roman"/>
+          <w:b/>
+          <w:bCs/>
+          <w:color w:val="1F1F1F"/>
+          <w:sz w:val="28"/>
+          <w:szCs w:val="28"/>
+        </w:rPr>
+        <w:t>,</w:t>
+      </w:r>
+      <w:r>
+        <w:rPr>
+          <w:rFonts w:ascii="Times New Roman" w:eastAsia="Google Sans Text" w:hAnsi="Times New Roman" w:cs="Times New Roman"/>
+          <w:b/>
+          <w:bCs/>
+          <w:color w:val="1F1F1F"/>
+          <w:sz w:val="28"/>
+          <w:szCs w:val="28"/>
+        </w:rPr>
+        <w:t xml:space="preserve"> yên bờ cõi</w:t>
+      </w:r>
+    </w:p>
+    <w:p>
+      <w:pPr>
+        <w:pBdr>
+          <w:top w:val="nil"/>
+          <w:left w:val="nil"/>
+          <w:bottom w:val="nil"/>
+          <w:right w:val="nil"/>
+          <w:between w:val="nil"/>
+        </w:pBdr>
+        <w:jc w:val="center"/>
+        <w:rPr>
+          <w:rFonts w:ascii="Times New Roman" w:eastAsia="Google Sans Text" w:hAnsi="Times New Roman" w:cs="Times New Roman"/>
+          <w:color w:val="1F1F1F"/>
+          <w:sz w:val="28"/>
+          <w:szCs w:val="28"/>
+        </w:rPr>
+      </w:pPr>
+      <w:r>
+        <w:rPr>
+          <w:rFonts w:ascii="Times New Roman" w:eastAsia="Google Sans Text" w:hAnsi="Times New Roman" w:cs="Times New Roman"/>
+          <w:b/>
+          <w:bCs/>
+          <w:color w:val="1F1F1F"/>
+          <w:sz w:val="28"/>
+          <w:szCs w:val="28"/>
+        </w:rPr>
+        <w:t>Bánh vuông sắc cạnh, pháp luật nghiêm minh</w:t>
+      </w:r>
+      <w:r>
+        <w:rPr>
+          <w:rFonts w:ascii="Times New Roman" w:eastAsia="Google Sans Text" w:hAnsi="Times New Roman" w:cs="Times New Roman"/>
+          <w:b/>
+          <w:bCs/>
+          <w:color w:val="1F1F1F"/>
+          <w:sz w:val="28"/>
+          <w:szCs w:val="28"/>
+        </w:rPr>
+        <w:t>,</w:t>
+      </w:r>
+      <w:r>
+        <w:rPr>
+          <w:rFonts w:ascii="Times New Roman" w:eastAsia="Google Sans Text" w:hAnsi="Times New Roman" w:cs="Times New Roman"/>
+          <w:b/>
+          <w:bCs/>
+          <w:color w:val="1F1F1F"/>
+          <w:sz w:val="28"/>
+          <w:szCs w:val="28"/>
+        </w:rPr>
+        <w:t xml:space="preserve"> giữ kỷ cương'</w:t>
       </w:r>
     </w:p>
     <w:p>
@@ -931,11 +973,53 @@
       <w:r>
         <w:rPr>
           <w:rFonts w:ascii="Times New Roman" w:eastAsia="Google Sans Text" w:hAnsi="Times New Roman" w:cs="Times New Roman"/>
-          <w:color w:val="1F1F1F"/>
-          <w:sz w:val="28"/>
-          <w:szCs w:val="28"/>
-        </w:rPr>
-        <w:t>(Chuyển sang mâm ngũ quả - Giọng hào hứng, tự hào hơn)</w:t>
+          <w:b/>
+          <w:bCs/>
+          <w:color w:val="1F1F1F"/>
+          <w:sz w:val="28"/>
+          <w:szCs w:val="28"/>
+        </w:rPr>
+        <w:t xml:space="preserve">- </w:t>
+      </w:r>
+      <w:r>
+        <w:rPr>
+          <w:rFonts w:ascii="Times New Roman" w:eastAsia="Google Sans Text" w:hAnsi="Times New Roman" w:cs="Times New Roman"/>
+          <w:b/>
+          <w:bCs/>
+          <w:color w:val="1F1F1F"/>
+          <w:sz w:val="28"/>
+          <w:szCs w:val="28"/>
+        </w:rPr>
+        <w:t>Về chất lượng:</w:t>
+      </w:r>
+      <w:r>
+        <w:rPr>
+          <w:rFonts w:ascii="Times New Roman" w:eastAsia="Google Sans Text" w:hAnsi="Times New Roman" w:cs="Times New Roman"/>
+          <w:color w:val="1F1F1F"/>
+          <w:sz w:val="28"/>
+          <w:szCs w:val="28"/>
+        </w:rPr>
+        <w:t xml:space="preserve"> Nhân bánh đậm đà, được chọn lọc kỹ lưỡng cũng giống như sự </w:t>
+      </w:r>
+      <w:r>
+        <w:rPr>
+          <w:rFonts w:ascii="Times New Roman" w:eastAsia="Google Sans Text" w:hAnsi="Times New Roman" w:cs="Times New Roman"/>
+          <w:b/>
+          <w:bCs/>
+          <w:color w:val="1F1F1F"/>
+          <w:sz w:val="28"/>
+          <w:szCs w:val="28"/>
+        </w:rPr>
+        <w:t>tinh nhuệ, hiện đại</w:t>
+      </w:r>
+      <w:r>
+        <w:rPr>
+          <w:rFonts w:ascii="Times New Roman" w:eastAsia="Google Sans Text" w:hAnsi="Times New Roman" w:cs="Times New Roman"/>
+          <w:color w:val="1F1F1F"/>
+          <w:sz w:val="28"/>
+          <w:szCs w:val="28"/>
+        </w:rPr>
+        <w:t xml:space="preserve"> của lực lượng An ninh mạng (PA05). Trong bối cảnh mới, chúng tôi luôn phải chắt lọc thông tin, xử lý chính xác để bảo vệ an toàn cho hệ thống an ninh quốc gia.</w:t>
       </w:r>
     </w:p>
     <w:p>
@@ -963,7 +1047,7 @@
           <w:sz w:val="28"/>
           <w:szCs w:val="28"/>
         </w:rPr>
-        <w:t>"Bên cạnh sự vuông vức của bánh chưng là sự hài hòa, rực rỡ của Mâm ngũ quả. Chúng tôi chọn lọc 5 loại quả đặc trưng, gửi gắm triết lý hành động của người chiến sĩ An ninh:</w:t>
+        <w:t>(Chuyển sang mâm ngũ quả - Giọng hào hứng, tự hào hơn)</w:t>
       </w:r>
     </w:p>
     <w:p>
@@ -987,43 +1071,12 @@
       <w:r>
         <w:rPr>
           <w:rFonts w:ascii="Times New Roman" w:eastAsia="Google Sans Text" w:hAnsi="Times New Roman" w:cs="Times New Roman"/>
-          <w:b/>
-          <w:bCs/>
-          <w:color w:val="1F1F1F"/>
-          <w:sz w:val="28"/>
-          <w:szCs w:val="28"/>
-        </w:rPr>
-        <w:t xml:space="preserve">- </w:t>
-      </w:r>
-      <w:r>
-        <w:rPr>
-          <w:rFonts w:ascii="Times New Roman" w:eastAsia="Google Sans Text" w:hAnsi="Times New Roman" w:cs="Times New Roman"/>
-          <w:b/>
-          <w:bCs/>
-          <w:color w:val="1F1F1F"/>
-          <w:sz w:val="28"/>
-          <w:szCs w:val="28"/>
-        </w:rPr>
-        <w:t>Nải chuối xanh:</w:t>
-      </w:r>
-      <w:r>
-        <w:rPr>
-          <w:rFonts w:ascii="Times New Roman" w:eastAsia="Google Sans Text" w:hAnsi="Times New Roman" w:cs="Times New Roman"/>
-          <w:color w:val="1F1F1F"/>
-          <w:sz w:val="28"/>
-          <w:szCs w:val="28"/>
-        </w:rPr>
-        <w:t xml:space="preserve"> Như bàn tay ngửa lên bao bọc, chở che. Đó là hình ảnh của </w:t>
-      </w:r>
-      <w:r>
-        <w:rPr>
-          <w:rFonts w:ascii="Times New Roman" w:eastAsia="Google Sans Text" w:hAnsi="Times New Roman" w:cs="Times New Roman"/>
           <w:color w:val="1F1F1F"/>
           <w:sz w:val="28"/>
           <w:szCs w:val="28"/>
         </w:rPr>
         <w:lastRenderedPageBreak/>
-        <w:t>lực lượng An ninh luôn là điểm tựa vững chắc, bao bọc sự bình yên cho nhân dân. Màu xanh cũng là màu của hy vọng, của sức trẻ thanh niên 4 đơn vị chúng tôi.</w:t>
+        <w:t>"Bên cạnh sự vuông vức của bánh chưng là sự hài hòa, rực rỡ của Mâm ngũ quả. Chúng tôi chọn lọc những thức quả tươi ngon nhất, gửi gắm triết lý hành động:</w:t>
       </w:r>
     </w:p>
     <w:p>
@@ -1064,56 +1117,16 @@
           <w:sz w:val="28"/>
           <w:szCs w:val="28"/>
         </w:rPr>
-        <w:t>Quả Bưởi (hoặc Phật thủ) vàng óng:</w:t>
-      </w:r>
-      <w:r>
-        <w:rPr>
-          <w:rFonts w:ascii="Times New Roman" w:eastAsia="Google Sans Text" w:hAnsi="Times New Roman" w:cs="Times New Roman"/>
-          <w:color w:val="1F1F1F"/>
-          <w:sz w:val="28"/>
-          <w:szCs w:val="28"/>
-        </w:rPr>
-        <w:t xml:space="preserve"> Đặt ở trọng tâm, tượng trưng cho sự viên mãn, tròn trịa. Với PA01 và PA08, đây là biểu tượng cho sự </w:t>
-      </w:r>
-      <w:r>
-        <w:rPr>
-          <w:rFonts w:ascii="Times New Roman" w:eastAsia="Google Sans Text" w:hAnsi="Times New Roman" w:cs="Times New Roman"/>
-          <w:b/>
-          <w:bCs/>
-          <w:color w:val="1F1F1F"/>
-          <w:sz w:val="28"/>
-          <w:szCs w:val="28"/>
-        </w:rPr>
-        <w:t>kín kẽ, toàn diện</w:t>
-      </w:r>
-      <w:r>
-        <w:rPr>
-          <w:rFonts w:ascii="Times New Roman" w:eastAsia="Google Sans Text" w:hAnsi="Times New Roman" w:cs="Times New Roman"/>
-          <w:color w:val="1F1F1F"/>
-          <w:sz w:val="28"/>
-          <w:szCs w:val="28"/>
-        </w:rPr>
-        <w:t xml:space="preserve"> trong thế trận an ninh. Đó là sự kết hợp giữa </w:t>
-      </w:r>
-      <w:r>
-        <w:rPr>
-          <w:rFonts w:ascii="Times New Roman" w:eastAsia="Google Sans Text" w:hAnsi="Times New Roman" w:cs="Times New Roman"/>
-          <w:b/>
-          <w:bCs/>
-          <w:color w:val="1F1F1F"/>
-          <w:sz w:val="28"/>
-          <w:szCs w:val="28"/>
-        </w:rPr>
-        <w:t>công tác phản gián, đảm bảo an ninh du lịch</w:t>
-      </w:r>
-      <w:r>
-        <w:rPr>
-          <w:rFonts w:ascii="Times New Roman" w:eastAsia="Google Sans Text" w:hAnsi="Times New Roman" w:cs="Times New Roman"/>
-          <w:color w:val="1F1F1F"/>
-          <w:sz w:val="28"/>
-          <w:szCs w:val="28"/>
-        </w:rPr>
-        <w:t xml:space="preserve"> với quản lý xuất nhập cảnh chặt chẽ, giữ cho địa bàn luôn 'trong ấm, ngoài êm', chủ động phòng ngừa từ xa.</w:t>
+        <w:t>Nải chuối xanh:</w:t>
+      </w:r>
+      <w:r>
+        <w:rPr>
+          <w:rFonts w:ascii="Times New Roman" w:eastAsia="Google Sans Text" w:hAnsi="Times New Roman" w:cs="Times New Roman"/>
+          <w:color w:val="1F1F1F"/>
+          <w:sz w:val="28"/>
+          <w:szCs w:val="28"/>
+        </w:rPr>
+        <w:t xml:space="preserve"> Như bàn tay ngửa lên bao bọc, chở che. Đó là hình ảnh của lực lượng An ninh luôn là điểm tựa vững chắc, bao bọc sự bình yên cho nhân dân.</w:t>
       </w:r>
     </w:p>
     <w:p>
@@ -1154,16 +1167,36 @@
           <w:sz w:val="28"/>
           <w:szCs w:val="28"/>
         </w:rPr>
-        <w:t>Quả Sung và Đu đủ:</w:t>
-      </w:r>
-      <w:r>
-        <w:rPr>
-          <w:rFonts w:ascii="Times New Roman" w:eastAsia="Google Sans Text" w:hAnsi="Times New Roman" w:cs="Times New Roman"/>
-          <w:color w:val="1F1F1F"/>
-          <w:sz w:val="28"/>
-          <w:szCs w:val="28"/>
-        </w:rPr>
-        <w:t xml:space="preserve"> Biểu thị cho sự sung túc và đủ đầy. Nhưng với góc nhìn của lính trinh sát công nghệ PA05, 'sung' là sung sức, là năng lượng dồi dào để chạy đua với tội phạm mạng; 'đủ' là đủ bản lĩnh, đủ trí tuệ để làm chủ công nghệ.</w:t>
+        <w:t>Quả Bưởi đỏ:</w:t>
+      </w:r>
+      <w:r>
+        <w:rPr>
+          <w:rFonts w:ascii="Times New Roman" w:eastAsia="Google Sans Text" w:hAnsi="Times New Roman" w:cs="Times New Roman"/>
+          <w:color w:val="1F1F1F"/>
+          <w:sz w:val="28"/>
+          <w:szCs w:val="28"/>
+        </w:rPr>
+        <w:t xml:space="preserve"> Đặt ở trọng tâm với màu đỏ thắm – màu của nhiệt huyết và sự may mắn. Với người chiến sĩ An ninh, đây là biểu tượng cho </w:t>
+      </w:r>
+      <w:r>
+        <w:rPr>
+          <w:rFonts w:ascii="Times New Roman" w:eastAsia="Google Sans Text" w:hAnsi="Times New Roman" w:cs="Times New Roman"/>
+          <w:b/>
+          <w:bCs/>
+          <w:color w:val="1F1F1F"/>
+          <w:sz w:val="28"/>
+          <w:szCs w:val="28"/>
+        </w:rPr>
+        <w:t>tấm lòng son sắt</w:t>
+      </w:r>
+      <w:r>
+        <w:rPr>
+          <w:rFonts w:ascii="Times New Roman" w:eastAsia="Google Sans Text" w:hAnsi="Times New Roman" w:cs="Times New Roman"/>
+          <w:color w:val="1F1F1F"/>
+          <w:sz w:val="28"/>
+          <w:szCs w:val="28"/>
+        </w:rPr>
+        <w:t>, tuyệt đối trung thành với Đảng, với Tổ quốc.</w:t>
       </w:r>
     </w:p>
     <w:p>
@@ -1204,16 +1237,76 @@
           <w:sz w:val="28"/>
           <w:szCs w:val="28"/>
         </w:rPr>
-        <w:t>Điểm xuyết những trái ớt đỏ, quất vàng:</w:t>
-      </w:r>
-      <w:r>
-        <w:rPr>
-          <w:rFonts w:ascii="Times New Roman" w:eastAsia="Google Sans Text" w:hAnsi="Times New Roman" w:cs="Times New Roman"/>
-          <w:color w:val="1F1F1F"/>
-          <w:sz w:val="28"/>
-          <w:szCs w:val="28"/>
-        </w:rPr>
-        <w:t xml:space="preserve"> Màu sắc rực rỡ tượng trưng cho may mắn, nhưng cũng là những 'tín hiệu cảnh báo' sắc bén. Chúng tôi luôn thường trực chiến đấu, sẵn sàng phát hiện và ngăn chặn mọi nguy cơ an ninh dù là nhỏ nhất.</w:t>
+        <w:t>Chùm nho và Trái táo:</w:t>
+      </w:r>
+      <w:r>
+        <w:rPr>
+          <w:rFonts w:ascii="Times New Roman" w:eastAsia="Google Sans Text" w:hAnsi="Times New Roman" w:cs="Times New Roman"/>
+          <w:color w:val="1F1F1F"/>
+          <w:sz w:val="28"/>
+          <w:szCs w:val="28"/>
+        </w:rPr>
+        <w:t xml:space="preserve"> Thay vì chọn sự 'đủ đầy' đơn thuần, chúng tôi chọn </w:t>
+      </w:r>
+      <w:r>
+        <w:rPr>
+          <w:rFonts w:ascii="Times New Roman" w:eastAsia="Google Sans Text" w:hAnsi="Times New Roman" w:cs="Times New Roman"/>
+          <w:b/>
+          <w:bCs/>
+          <w:color w:val="1F1F1F"/>
+          <w:sz w:val="28"/>
+          <w:szCs w:val="28"/>
+        </w:rPr>
+        <w:t>Chùm nho</w:t>
+      </w:r>
+      <w:r>
+        <w:rPr>
+          <w:rFonts w:ascii="Times New Roman" w:eastAsia="Google Sans Text" w:hAnsi="Times New Roman" w:cs="Times New Roman"/>
+          <w:color w:val="1F1F1F"/>
+          <w:sz w:val="28"/>
+          <w:szCs w:val="28"/>
+        </w:rPr>
+        <w:t xml:space="preserve"> kết lại chặt chẽ - tượng trưng cho sự liên kết mạng lưới thông suốt, đặc biệt là trong thế trận </w:t>
+      </w:r>
+      <w:r>
+        <w:rPr>
+          <w:rFonts w:ascii="Times New Roman" w:eastAsia="Google Sans Text" w:hAnsi="Times New Roman" w:cs="Times New Roman"/>
+          <w:b/>
+          <w:bCs/>
+          <w:color w:val="1F1F1F"/>
+          <w:sz w:val="28"/>
+          <w:szCs w:val="28"/>
+        </w:rPr>
+        <w:t>an ninh</w:t>
+      </w:r>
+      <w:r>
+        <w:rPr>
+          <w:rFonts w:ascii="Times New Roman" w:eastAsia="Google Sans Text" w:hAnsi="Times New Roman" w:cs="Times New Roman"/>
+          <w:color w:val="1F1F1F"/>
+          <w:sz w:val="28"/>
+          <w:szCs w:val="28"/>
+        </w:rPr>
+        <w:t xml:space="preserve"> và sự phối hợp nhịp nhàng giữa các đơn vị. Những trái táo căng tròn thể hiện cho những </w:t>
+      </w:r>
+      <w:r>
+        <w:rPr>
+          <w:rFonts w:ascii="Times New Roman" w:eastAsia="Google Sans Text" w:hAnsi="Times New Roman" w:cs="Times New Roman"/>
+          <w:b/>
+          <w:bCs/>
+          <w:color w:val="1F1F1F"/>
+          <w:sz w:val="28"/>
+          <w:szCs w:val="28"/>
+        </w:rPr>
+        <w:t>thành quả</w:t>
+      </w:r>
+      <w:r>
+        <w:rPr>
+          <w:rFonts w:ascii="Times New Roman" w:eastAsia="Google Sans Text" w:hAnsi="Times New Roman" w:cs="Times New Roman"/>
+          <w:color w:val="1F1F1F"/>
+          <w:sz w:val="28"/>
+          <w:szCs w:val="28"/>
+        </w:rPr>
+        <w:t xml:space="preserve"> ngọt ngào, những chiến công mà liên quân quyết tâm gặt hái.</w:t>
       </w:r>
     </w:p>
     <w:p>
@@ -1237,51 +1330,81 @@
       <w:r>
         <w:rPr>
           <w:rFonts w:ascii="Times New Roman" w:eastAsia="Google Sans Text" w:hAnsi="Times New Roman" w:cs="Times New Roman"/>
-          <w:color w:val="1F1F1F"/>
-          <w:sz w:val="28"/>
-          <w:szCs w:val="28"/>
-        </w:rPr>
-        <w:t xml:space="preserve">Tổng hòa mâm ngũ quả là khát vọng </w:t>
-      </w:r>
-      <w:r>
-        <w:rPr>
-          <w:rFonts w:ascii="Times New Roman" w:eastAsia="Google Sans Text" w:hAnsi="Times New Roman" w:cs="Times New Roman"/>
-          <w:b/>
-          <w:bCs/>
-          <w:color w:val="1F1F1F"/>
-          <w:sz w:val="28"/>
-          <w:szCs w:val="28"/>
-        </w:rPr>
-        <w:t>'Ngũ phúc lâm môn'</w:t>
-      </w:r>
-      <w:r>
-        <w:rPr>
-          <w:rFonts w:ascii="Times New Roman" w:eastAsia="Google Sans Text" w:hAnsi="Times New Roman" w:cs="Times New Roman"/>
-          <w:color w:val="1F1F1F"/>
-          <w:sz w:val="28"/>
-          <w:szCs w:val="28"/>
-        </w:rPr>
-        <w:t xml:space="preserve">: Phú - Quý - Thọ - Khang - Ninh. Trong đó, chữ </w:t>
-      </w:r>
-      <w:r>
-        <w:rPr>
-          <w:rFonts w:ascii="Times New Roman" w:eastAsia="Google Sans Text" w:hAnsi="Times New Roman" w:cs="Times New Roman"/>
-          <w:b/>
-          <w:bCs/>
-          <w:color w:val="1F1F1F"/>
-          <w:sz w:val="28"/>
-          <w:szCs w:val="28"/>
-        </w:rPr>
-        <w:t>'Ninh'</w:t>
-      </w:r>
-      <w:r>
-        <w:rPr>
-          <w:rFonts w:ascii="Times New Roman" w:eastAsia="Google Sans Text" w:hAnsi="Times New Roman" w:cs="Times New Roman"/>
-          <w:color w:val="1F1F1F"/>
-          <w:sz w:val="28"/>
-          <w:szCs w:val="28"/>
-        </w:rPr>
-        <w:t xml:space="preserve"> (trong An ninh) là điều mà Đội 2 chúng tôi cam kết gìn giữ."</w:t>
+          <w:b/>
+          <w:bCs/>
+          <w:color w:val="1F1F1F"/>
+          <w:sz w:val="28"/>
+          <w:szCs w:val="28"/>
+        </w:rPr>
+        <w:t xml:space="preserve">- </w:t>
+      </w:r>
+      <w:r>
+        <w:rPr>
+          <w:rFonts w:ascii="Times New Roman" w:eastAsia="Google Sans Text" w:hAnsi="Times New Roman" w:cs="Times New Roman"/>
+          <w:b/>
+          <w:bCs/>
+          <w:color w:val="1F1F1F"/>
+          <w:sz w:val="28"/>
+          <w:szCs w:val="28"/>
+        </w:rPr>
+        <w:t>Điểm xuyết những trái ớt đỏ rực:</w:t>
+      </w:r>
+      <w:r>
+        <w:rPr>
+          <w:rFonts w:ascii="Times New Roman" w:eastAsia="Google Sans Text" w:hAnsi="Times New Roman" w:cs="Times New Roman"/>
+          <w:color w:val="1F1F1F"/>
+          <w:sz w:val="28"/>
+          <w:szCs w:val="28"/>
+        </w:rPr>
+        <w:t xml:space="preserve"> Được tạo hình như những ngọn lửa. Màu sắc rực rỡ tượng trưng cho khí thế hừng hực, nhưng cũng là những 'tín hiệu cảnh báo' sắc bén trước mọi âm mưu của tội phạm.</w:t>
+      </w:r>
+    </w:p>
+    <w:p>
+      <w:pPr>
+        <w:pBdr>
+          <w:top w:val="nil"/>
+          <w:left w:val="nil"/>
+          <w:bottom w:val="nil"/>
+          <w:right w:val="nil"/>
+          <w:between w:val="nil"/>
+        </w:pBdr>
+        <w:ind w:firstLine="720"/>
+        <w:jc w:val="both"/>
+        <w:rPr>
+          <w:rFonts w:ascii="Times New Roman" w:eastAsia="Google Sans Text" w:hAnsi="Times New Roman" w:cs="Times New Roman"/>
+          <w:color w:val="1F1F1F"/>
+          <w:sz w:val="28"/>
+          <w:szCs w:val="28"/>
+        </w:rPr>
+      </w:pPr>
+      <w:r>
+        <w:rPr>
+          <w:rFonts w:ascii="Times New Roman" w:eastAsia="Google Sans Text" w:hAnsi="Times New Roman" w:cs="Times New Roman"/>
+          <w:color w:val="1F1F1F"/>
+          <w:sz w:val="28"/>
+          <w:szCs w:val="28"/>
+        </w:rPr>
+        <w:t xml:space="preserve">Tổng hòa mâm ngũ quả với dòng chữ </w:t>
+      </w:r>
+      <w:r>
+        <w:rPr>
+          <w:rFonts w:ascii="Times New Roman" w:eastAsia="Google Sans Text" w:hAnsi="Times New Roman" w:cs="Times New Roman"/>
+          <w:b/>
+          <w:bCs/>
+          <w:color w:val="1F1F1F"/>
+          <w:sz w:val="28"/>
+          <w:szCs w:val="28"/>
+        </w:rPr>
+        <w:t>'Tết Đoàn Viên'</w:t>
+      </w:r>
+      <w:r>
+        <w:rPr>
+          <w:rFonts w:ascii="Times New Roman" w:eastAsia="Google Sans Text" w:hAnsi="Times New Roman" w:cs="Times New Roman"/>
+          <w:color w:val="1F1F1F"/>
+          <w:sz w:val="28"/>
+          <w:szCs w:val="28"/>
+        </w:rPr>
+        <w:t xml:space="preserve"> là lời khẳng định: An ninh có vững vàng, Tổ quốc có bình yên thì mọi nhà mới có được cái Tết sum vầy trọn vẹn."</w:t>
       </w:r>
     </w:p>
     <w:p>
@@ -2545,6 +2668,155 @@
       </w:rPr>
     </w:lvl>
   </w:abstractNum>
+  <w:abstractNum w:abstractNumId="6" w15:restartNumberingAfterBreak="0">
+    <w:nsid w:val="7DD11A10"/>
+    <w:multiLevelType w:val="multilevel"/>
+    <w:tmpl w:val="2EAC08CC"/>
+    <w:lvl w:ilvl="0">
+      <w:start w:val="1"/>
+      <w:numFmt w:val="bullet"/>
+      <w:lvlText w:val=""/>
+      <w:lvlJc w:val="left"/>
+      <w:pPr>
+        <w:tabs>
+          <w:tab w:val="num" w:pos="720"/>
+        </w:tabs>
+        <w:ind w:left="720" w:hanging="360"/>
+      </w:pPr>
+      <w:rPr>
+        <w:rFonts w:ascii="Symbol" w:hAnsi="Symbol" w:hint="default"/>
+        <w:sz w:val="20"/>
+      </w:rPr>
+    </w:lvl>
+    <w:lvl w:ilvl="1" w:tentative="1">
+      <w:start w:val="1"/>
+      <w:numFmt w:val="bullet"/>
+      <w:lvlText w:val="o"/>
+      <w:lvlJc w:val="left"/>
+      <w:pPr>
+        <w:tabs>
+          <w:tab w:val="num" w:pos="1440"/>
+        </w:tabs>
+        <w:ind w:left="1440" w:hanging="360"/>
+      </w:pPr>
+      <w:rPr>
+        <w:rFonts w:ascii="Courier New" w:hAnsi="Courier New" w:hint="default"/>
+        <w:sz w:val="20"/>
+      </w:rPr>
+    </w:lvl>
+    <w:lvl w:ilvl="2" w:tentative="1">
+      <w:start w:val="1"/>
+      <w:numFmt w:val="bullet"/>
+      <w:lvlText w:val=""/>
+      <w:lvlJc w:val="left"/>
+      <w:pPr>
+        <w:tabs>
+          <w:tab w:val="num" w:pos="2160"/>
+        </w:tabs>
+        <w:ind w:left="2160" w:hanging="360"/>
+      </w:pPr>
+      <w:rPr>
+        <w:rFonts w:ascii="Wingdings" w:hAnsi="Wingdings" w:hint="default"/>
+        <w:sz w:val="20"/>
+      </w:rPr>
+    </w:lvl>
+    <w:lvl w:ilvl="3" w:tentative="1">
+      <w:start w:val="1"/>
+      <w:numFmt w:val="bullet"/>
+      <w:lvlText w:val=""/>
+      <w:lvlJc w:val="left"/>
+      <w:pPr>
+        <w:tabs>
+          <w:tab w:val="num" w:pos="2880"/>
+        </w:tabs>
+        <w:ind w:left="2880" w:hanging="360"/>
+      </w:pPr>
+      <w:rPr>
+        <w:rFonts w:ascii="Wingdings" w:hAnsi="Wingdings" w:hint="default"/>
+        <w:sz w:val="20"/>
+      </w:rPr>
+    </w:lvl>
+    <w:lvl w:ilvl="4" w:tentative="1">
+      <w:start w:val="1"/>
+      <w:numFmt w:val="bullet"/>
+      <w:lvlText w:val=""/>
+      <w:lvlJc w:val="left"/>
+      <w:pPr>
+        <w:tabs>
+          <w:tab w:val="num" w:pos="3600"/>
+        </w:tabs>
+        <w:ind w:left="3600" w:hanging="360"/>
+      </w:pPr>
+      <w:rPr>
+        <w:rFonts w:ascii="Wingdings" w:hAnsi="Wingdings" w:hint="default"/>
+        <w:sz w:val="20"/>
+      </w:rPr>
+    </w:lvl>
+    <w:lvl w:ilvl="5" w:tentative="1">
+      <w:start w:val="1"/>
+      <w:numFmt w:val="bullet"/>
+      <w:lvlText w:val=""/>
+      <w:lvlJc w:val="left"/>
+      <w:pPr>
+        <w:tabs>
+          <w:tab w:val="num" w:pos="4320"/>
+        </w:tabs>
+        <w:ind w:left="4320" w:hanging="360"/>
+      </w:pPr>
+      <w:rPr>
+        <w:rFonts w:ascii="Wingdings" w:hAnsi="Wingdings" w:hint="default"/>
+        <w:sz w:val="20"/>
+      </w:rPr>
+    </w:lvl>
+    <w:lvl w:ilvl="6" w:tentative="1">
+      <w:start w:val="1"/>
+      <w:numFmt w:val="bullet"/>
+      <w:lvlText w:val=""/>
+      <w:lvlJc w:val="left"/>
+      <w:pPr>
+        <w:tabs>
+          <w:tab w:val="num" w:pos="5040"/>
+        </w:tabs>
+        <w:ind w:left="5040" w:hanging="360"/>
+      </w:pPr>
+      <w:rPr>
+        <w:rFonts w:ascii="Wingdings" w:hAnsi="Wingdings" w:hint="default"/>
+        <w:sz w:val="20"/>
+      </w:rPr>
+    </w:lvl>
+    <w:lvl w:ilvl="7" w:tentative="1">
+      <w:start w:val="1"/>
+      <w:numFmt w:val="bullet"/>
+      <w:lvlText w:val=""/>
+      <w:lvlJc w:val="left"/>
+      <w:pPr>
+        <w:tabs>
+          <w:tab w:val="num" w:pos="5760"/>
+        </w:tabs>
+        <w:ind w:left="5760" w:hanging="360"/>
+      </w:pPr>
+      <w:rPr>
+        <w:rFonts w:ascii="Wingdings" w:hAnsi="Wingdings" w:hint="default"/>
+        <w:sz w:val="20"/>
+      </w:rPr>
+    </w:lvl>
+    <w:lvl w:ilvl="8" w:tentative="1">
+      <w:start w:val="1"/>
+      <w:numFmt w:val="bullet"/>
+      <w:lvlText w:val=""/>
+      <w:lvlJc w:val="left"/>
+      <w:pPr>
+        <w:tabs>
+          <w:tab w:val="num" w:pos="6480"/>
+        </w:tabs>
+        <w:ind w:left="6480" w:hanging="360"/>
+      </w:pPr>
+      <w:rPr>
+        <w:rFonts w:ascii="Wingdings" w:hAnsi="Wingdings" w:hint="default"/>
+        <w:sz w:val="20"/>
+      </w:rPr>
+    </w:lvl>
+  </w:abstractNum>
   <w:num w:numId="1" w16cid:durableId="1179084010">
     <w:abstractNumId w:val="5"/>
   </w:num>
@@ -2562,6 +2834,9 @@
   </w:num>
   <w:num w:numId="6" w16cid:durableId="815882004">
     <w:abstractNumId w:val="3"/>
+  </w:num>
+  <w:num w:numId="7" w16cid:durableId="1996296839">
+    <w:abstractNumId w:val="6"/>
   </w:num>
 </w:numbering>
 </file>

</xml_diff>